<commit_message>
Tous les centres ont un laboratoire : CS09 suit le circuit commun
Le centre récemment érigé (CS09) n'est plus présenté sans laboratoire :
la glycémie de la première CPN y est demandée par la CPN et faite au
laboratoire, et le glucomètre neuf de la CPN sert aux urgences.
Grille d'observation, entretien de P16 (code B11), tableau V et texte
des résultats adaptés.

Co-Authored-By: Claude Opus 5.5 <noreply@anthropic.com>
Claude-Session: https://claude.ai/code/session_01HxwPseJn9EZbm4HRSeCoVh
</commit_message>
<xml_diff>
--- a/memoire-ngoma/livrables/Annexe_2_Grilles_observation_remplies.docx
+++ b/memoire-ngoma/livrables/Annexe_2_Grilles_observation_remplies.docx
@@ -26289,7 +26289,7 @@
                 <w:sz w:val="19"/>
                 <w:szCs w:val="19"/>
               </w:rPr>
-              <w:t xml:space="preserve">1</w:t>
+              <w:t xml:space="preserve">2</w:t>
             </w:r>
           </w:p>
         </w:tc>
@@ -26313,7 +26313,7 @@
                 <w:sz w:val="19"/>
                 <w:szCs w:val="19"/>
               </w:rPr>
-              <w:t xml:space="preserve">NEUF, fonctionnel — en salle de CPN (le laboratoire n'est pas encore opérationnel)</w:t>
+              <w:t xml:space="preserve">fonctionnels — 1 au laboratoire ; 1 NEUF en salle de CPN pour les urgences, livré avec le kit de CPN</w:t>
             </w:r>
           </w:p>
         </w:tc>
@@ -26337,7 +26337,7 @@
                 <w:sz w:val="19"/>
                 <w:szCs w:val="19"/>
               </w:rPr>
-              <w:t xml:space="preserve">Livré avec le kit de CPN à l'ouverture du centre : en attendant le laboratoire, la glycémie de la première CPN est faite à toutes par l'équipe de CPN.</w:t>
+              <w:t xml:space="preserve">Glycémie de la première CPN demandée par bon pour toutes et faite au laboratoire pendant la demi-journée ; ensuite sur facteurs de risque seulement.</w:t>
             </w:r>
           </w:p>
         </w:tc>
@@ -26462,7 +26462,7 @@
                 <w:sz w:val="19"/>
                 <w:szCs w:val="19"/>
               </w:rPr>
-              <w:t xml:space="preserve">Livrées avec l'appareil.</w:t>
+              <w:t xml:space="preserve">Au laboratoire.</w:t>
             </w:r>
           </w:p>
         </w:tc>
@@ -28257,7 +28257,7 @@
           <w:sz w:val="20"/>
           <w:szCs w:val="20"/>
         </w:rPr>
-        <w:t xml:space="preserve">Ce centre montre une forme d'inégalité qui n'est ni une rupture ni une panne : une dotation incomplète (laboratoire, bandelettes urinaires, registre). Le glucomètre livré avec le kit de CPN permet en revanche à l'équipe de CPN de faire elle-même le test de la première CPN en attendant le laboratoire. Il interroge le calendrier de mise en service plus que la gestion courante — élément non anticipé par la grille.</w:t>
+        <w:t xml:space="preserve">Ce centre montre une forme d'inégalité qui n'est ni une rupture ni une panne : une dotation incomplète (bandelettes urinaires, registre standard). La glycémie de la première CPN y suit le circuit des autres centres : bon de la CPN, test au laboratoire. Il interroge le calendrier de mise en service plus que la gestion courante — élément non anticipé par la grille.</w:t>
       </w:r>
     </w:p>
     <w:p>

</xml_diff>